<commit_message>
Revert Guion 1 title to the original VidIQ title
Creator's call: title reverts to "Why Smart People Make Terrible Money
Decisions" as VidIQ originally proposed. It repeats V15's opening words
("Why Smart People Can't Save Money"), which is why it was changed
earlier in this pipeline — but V15 is archived and won't publish, so the
wording collision the no-repeat-title rule guards against doesn't apply
in practice. Updated everywhere the old title appeared: script header,
CLAUDE.md S25 queue table, Cowork handoff doc, thumbnail prompts file,
and regenerated the ElevenLabs PDF and pre-publish checklist.

Co-Authored-By: Claude Sonnet 5 <noreply@anthropic.com>
Claude-Session: https://claude.ai/code/session_01BfxMYYixjDzUkMTesYme5Q
</commit_message>
<xml_diff>
--- a/GUION1_Prepublish_Checklist.docx
+++ b/GUION1_Prepublish_Checklist.docx
@@ -24,7 +24,7 @@
           <w:color w:val="777777"/>
           <w:sz w:val="18"/>
         </w:rPr>
-        <w:t>The 2.5x Bias That Cost Alex €34,000 (Loss Aversion) · Creator Brief v4 · 138 beats</w:t>
+        <w:t>Why Smart People Make Terrible Money Decisions · Creator Brief v4 · 138 beats</w:t>
       </w:r>
     </w:p>
     <w:p/>
@@ -58,7 +58,7 @@
           <w:color w:val="1A7A3C"/>
           <w:sz w:val="20"/>
         </w:rPr>
-        <w:t>the-2.5x-bias-that-cost-alex-34000-loss-aversion-neurocents.mp4</w:t>
+        <w:t>why-smart-people-make-terrible-money-decisions-neurocents.mp4</w:t>
       </w:r>
     </w:p>
     <w:p>
@@ -103,7 +103,7 @@
           <w:color w:val="2C3E50"/>
           <w:sz w:val="24"/>
         </w:rPr>
-        <w:t>The 2.5x Bias That Cost Alex €34,000 (Loss Aversion)</w:t>
+        <w:t>Why Smart People Make Terrible Money Decisions</w:t>
       </w:r>
     </w:p>
     <w:p>
@@ -116,7 +116,7 @@
           <w:color w:val="777777"/>
           <w:sz w:val="16"/>
         </w:rPr>
-        <w:t>Keyword pilar: 'loss aversion psychology' (17,243/mes · comp. 10.3 — mejor ratio volumen/competencia del canal hasta la fecha). Número en el título (S17) + nombre científico reconocible (Kahneman) como anzuelo de autoridad.</w:t>
+        <w:t>Keyword pilar: 'loss aversion psychology' (17,243/mes · comp. 10.3 — mejor ratio volumen/competencia del canal hasta la fecha). Patrón de estatus/inteligencia (993x, S21) tal cual propuso VidIQ originalmente.</w:t>
       </w:r>
     </w:p>
     <w:p>
@@ -126,10 +126,10 @@
       <w:r>
         <w:rPr>
           <w:b w:val="0"/>
-          <w:color w:val="777777"/>
+          <w:color w:val="B02A2A"/>
           <w:sz w:val="16"/>
         </w:rPr>
-        <w:t>Verificado sin colisión de wording con títulos anteriores del canal (V15 'Why Smart People Can't Save Money' fue la primera versión de este título y se descartó por esa razón).</w:t>
+        <w:t>NOTA: este título repite casi literalmente las 3 primeras palabras de V15 ('Why Smart People Can't Save Money'). Se había cambiado por eso, pero decisión del creador: mantenerlo igual — V15 está archivado y no se va a publicar, así que la colisión de wording no aplica en la práctica.</w:t>
       </w:r>
     </w:p>
     <w:p>
@@ -742,7 +742,7 @@
         <w:rPr>
           <w:sz w:val="20"/>
         </w:rPr>
-        <w:t>☐  Título:         The 2.5x Bias That Cost Alex €34,000 (Loss Aversion)</w:t>
+        <w:t>☐  Título:         Why Smart People Make Terrible Money Decisions</w:t>
       </w:r>
     </w:p>
     <w:p>
@@ -1540,7 +1540,7 @@
           <w:color w:val="777777"/>
           <w:sz w:val="16"/>
         </w:rPr>
-        <w:t>NEUROCENTS · GUION 1 · PRE-PUBLISH CHECKLIST · The 2.5x Bias That Cost Alex €34,000</w:t>
+        <w:t>NEUROCENTS · GUION 1 · PRE-PUBLISH CHECKLIST · Why Smart People Make Terrible Money Decisions</w:t>
       </w:r>
     </w:p>
     <w:sectPr>

</xml_diff>